<commit_message>
Rebuild KG v1 against dataset v4
264 entities (11 App, 21 Screen, 20 Attribute, 212 AnswerValue), up
from v3's 235 (9/19/20/187) -- Safari and Contacts apps/screens from
the v0.5.0 dataset addition now correctly represented. 1,087 relations,
up from 1,009. Single command (ml/scripts/build_kg.py), no manual
curation, consistent with how this KG has always been built.

Verified KGGuidedSelector runs cleanly against the full v4 pool (727
examples) post-rebuild.

Paper v5 and deck v5 updated to reflect this: the Section 6.2 sweep
still ran against the pre-rebuild (v3) KG, since it completed before
this rebuild -- documented as an open item (re-running the sweep
against the v4 KG), not silently backdated.
</commit_message>
<xml_diff>
--- a/paper/AXIOM_Mobile_Paper_v5.docx
+++ b/paper/AXIOM_Mobile_Paper_v5.docx
@@ -833,7 +833,16 @@
         <w:t xml:space="preserve">kg/relations.json</w:t>
       </w:r>
       <w:r>
-        <w:t xml:space="preserve">, 235 entities, 1,009 relations) extracted programmatically from the dataset’s own fields, unchanged from v4. Built from dataset v3; not yet rebuilt against dataset v4’s 46 new examples (Section 4.3).</w:t>
+        <w:t xml:space="preserve">) extracted programmatically from the dataset’s own fields – a single command (</w:t>
+      </w:r>
+      <w:r>
+        <w:rPr>
+          <w:rStyle w:val="VerbatimChar"/>
+        </w:rPr>
+        <w:t xml:space="preserve">ml/scripts/build_kg.py</w:t>
+      </w:r>
+      <w:r>
+        <w:t xml:space="preserve">), no manual curation, re-run after every dataset version rather than left stale. Rebuilt against dataset v4 for this draft: 264 entities (11 App, 21 Screen, 20 Attribute, 212 AnswerValue; up from v3’s 235/9/19/20/187), 1,087 relations (up from 1,009) – the new Safari and Contacts apps/screens from Section 4.1 are correctly reflected, verified by re-running the KG-guided selector against the full v4 pool.</w:t>
       </w:r>
     </w:p>
     <w:p>
@@ -1549,13 +1558,13 @@
           <w:b/>
           <w:bCs/>
         </w:rPr>
-        <w:t xml:space="preserve">KG staleness.</w:t>
-      </w:r>
-      <w:r>
-        <w:t xml:space="preserve"> </w:t>
-      </w:r>
-      <w:r>
-        <w:t xml:space="preserve">The knowledge graph (Section 3.3) was built from dataset v3 and has not been rebuilt against the 46 new v4 examples; KG-guided selection cannot yet prioritize coverage of the new Safari/Contacts content.</w:t>
+        <w:t xml:space="preserve">KG-guided selection strategy</w:t>
+      </w:r>
+      <w:r>
+        <w:t xml:space="preserve"> </w:t>
+      </w:r>
+      <w:r>
+        <w:t xml:space="preserve">(used in Section 6.2’s sweep) was run against the dataset-v3 KG, not the v4 rebuild described in Section 3.3 – the rebuild landed after that sweep completed. A re-run against the v4 KG, now available, has not yet been performed; the sweep’s qualitative finding (KG-guided strongest at practical budgets) is not expected to change from 29 additional Screen/Attribute regions, but this is not yet verified.</w:t>
       </w:r>
     </w:p>
     <w:p>
@@ -4309,13 +4318,13 @@
       </w:r>
     </w:p>
     <w:bookmarkEnd w:id="34"/>
-    <w:bookmarkStart w:id="35" w:name="kg-staleness"/>
+    <w:bookmarkStart w:id="35" w:name="X5fe1b802559919595a84912dcda4a71b716a1a3"/>
     <w:p>
       <w:pPr>
         <w:pStyle w:val="Heading3"/>
       </w:pPr>
       <w:r>
-        <w:t xml:space="preserve">9.3 KG Staleness</w:t>
+        <w:t xml:space="preserve">9.3 KG-Guided Sweep Ran Against the Pre-Rebuild KG</w:t>
       </w:r>
     </w:p>
     <w:p>
@@ -4323,7 +4332,7 @@
         <w:pStyle w:val="FirstParagraph"/>
       </w:pPr>
       <w:r>
-        <w:t xml:space="preserve">The knowledge graph has not been rebuilt against dataset v4’s new examples (Section 4.3); KG-guided selection in Section 6.2 operates over dataset-v3-derived KG regions only.</w:t>
+        <w:t xml:space="preserve">The knowledge graph has since been rebuilt against dataset v4 (Section 3.3), but the Section 6.2 sweep ran before that rebuild, against dataset-v3-derived KG regions. The 29.7% test EM at budget=150 (Section 6.2) reflects KG-guided selection with no visibility into the 46 new Safari/Contacts examples. Whether re-running against the v4 KG changes this result is not yet verified.</w:t>
       </w:r>
     </w:p>
     <w:bookmarkEnd w:id="35"/>

</xml_diff>